<commit_message>
Complete manual rev. 2 sync in workshop materials (Use recommended button)
- Pre-lab §2.6: one paragraph on the Use recommended button and its
  ~800-total-updates epoch choice
- Lab manual Part E1: Use recommended as the primary starting point,
  manual defaults table kept as the alternative
- Lesson slides: hyperparameter card now leads with Use recommended;
  training-demo bullet updated (was 'Defaults everywhere'); deploy-demo
  gains the serial-commands bullet (get ood / set ood defaults)
- Regenerated prelab.docx, labmanual.docx, and the Canva-ready pptx
</commit_message>
<xml_diff>
--- a/workshop/labmanual.docx
+++ b/workshop/labmanual.docx
@@ -3238,7 +3238,33 @@
           <w:sz w:val="21"/>
           <w:szCs w:val="21"/>
         </w:rPr>
-        <w:t xml:space="preserve"> icon. Begin with the default configuration:</w:t>
+        <w:t xml:space="preserve"> icon. Click </w:t>
+      </w:r>
+      <w:r>
+        <w:rPr>
+          <w:rFonts w:ascii="Arial" w:cs="Arial" w:eastAsia="Arial" w:hAnsi="Arial"/>
+          <w:b/>
+          <w:bCs/>
+          <w:i w:val="false"/>
+          <w:iCs w:val="false"/>
+          <w:color w:val="1A1C1C"/>
+          <w:sz w:val="21"/>
+          <w:szCs w:val="21"/>
+        </w:rPr>
+        <w:t xml:space="preserve">Use recommended</w:t>
+      </w:r>
+      <w:r>
+        <w:rPr>
+          <w:rFonts w:ascii="Arial" w:cs="Arial" w:eastAsia="Arial" w:hAnsi="Arial"/>
+          <w:b w:val="false"/>
+          <w:bCs w:val="false"/>
+          <w:i w:val="false"/>
+          <w:iCs w:val="false"/>
+          <w:color w:val="3F4141"/>
+          <w:sz w:val="21"/>
+          <w:szCs w:val="21"/>
+        </w:rPr>
+        <w:t xml:space="preserve"> to apply the recommended hyperparameters automatically — the epoch count is chosen so that training performs approximately 800 total weight updates. Alternatively, begin with the default configuration:</w:t>
       </w:r>
     </w:p>
     <w:tbl>

</xml_diff>